<commit_message>
Etapa 6: resaltar por color el origen de cada texto del informe .docx
Distingue visualmente, en el documento generado, qué texto viene de la
autoevaluación (dato de empresa), qué se calcula (puntaje/porcentaje/
clasificación), qué es plantilla fija por franja y qué es recomendación
de catálogo — para facilitar la validación piloto con el Dr. Sergio.
Activo por defecto (modo_revision=True) mientras dure esta etapa.
</commit_message>
<xml_diff>
--- a/service/app/templates/informe_base.docx
+++ b/service/app/templates/informe_base.docx
@@ -32,10 +32,105 @@
         <w:t xml:space="preserve">La NOM-036-1-STPS-2018 establece los lineamientos para identificar, analizar, prevenir y controlar los factores de riesgo ergonómico derivados del manejo manual de cargas en los centros de trabajo. El presente documento resume los resultados obtenidos al aplicar el instrumento de autoevaluación con base en dicha norma dentro de la empresa </w:t>
       </w:r>
       <w:r>
+        <w:t>{{r empresa_nombre }}.</w:t>
+      </w:r>
+    </w:p>
+    <w:p>
+      <w:r>
+        <w:t>{% if es_revision %}</w:t>
+      </w:r>
+    </w:p>
+    <w:p>
+      <w:pPr>
+        <w:pStyle w:val="Heading2"/>
+      </w:pPr>
+      <w:r>
+        <w:t>Guía de colores de este documento</w:t>
+      </w:r>
+    </w:p>
+    <w:p>
+      <w:r>
+        <w:t>Esta versión del informe, generada durante la etapa de validación piloto, resalta el texto según su origen dentro del motor de recomendaciones, para facilitar su revisión:</w:t>
+      </w:r>
+    </w:p>
+    <w:p>
+      <w:pPr>
+        <w:pStyle w:val="ListBullet"/>
+      </w:pPr>
+      <w:r>
         <w:rPr>
           <w:b/>
+          <w:shd w:val="clear" w:color="auto" w:fill="CFE2F3"/>
         </w:rPr>
-        <w:t>{{ empresa_nombre }}.</w:t>
+        <w:t>Dato de la empresa</w:t>
+      </w:r>
+      <w:r>
+        <w:t>: Texto ingresado directamente por la empresa en la autoevaluación (datos generales).</w:t>
+      </w:r>
+    </w:p>
+    <w:p>
+      <w:pPr>
+        <w:pStyle w:val="ListBullet"/>
+      </w:pPr>
+      <w:r>
+        <w:rPr>
+          <w:b/>
+          <w:shd w:val="clear" w:color="auto" w:fill="D9EAD3"/>
+        </w:rPr>
+        <w:t>Resultado calculado</w:t>
+      </w:r>
+      <w:r>
+        <w:t>: Puntaje, porcentaje y clasificación que obtiene el motor a partir de las respuestas.</w:t>
+      </w:r>
+    </w:p>
+    <w:p>
+      <w:pPr>
+        <w:pStyle w:val="ListBullet"/>
+      </w:pPr>
+      <w:r>
+        <w:rPr>
+          <w:b/>
+          <w:shd w:val="clear" w:color="auto" w:fill="E6D9F2"/>
+        </w:rPr>
+        <w:t>Plantilla fija</w:t>
+      </w:r>
+      <w:r>
+        <w:t>: Texto de apertura o cierre que depende solo de la franja de severidad — el mismo para cualquier empresa que caiga en ella.</w:t>
+      </w:r>
+    </w:p>
+    <w:p>
+      <w:pPr>
+        <w:pStyle w:val="ListBullet"/>
+      </w:pPr>
+      <w:r>
+        <w:rPr>
+          <w:b/>
+          <w:shd w:val="clear" w:color="auto" w:fill="FCE5CD"/>
+        </w:rPr>
+        <w:t>Recomendación de catálogo</w:t>
+      </w:r>
+      <w:r>
+        <w:t>: Texto elegido del catálogo ítem-nivel según la respuesta específica de la empresa.</w:t>
+      </w:r>
+    </w:p>
+    <w:p>
+      <w:pPr>
+        <w:pStyle w:val="ListBullet"/>
+      </w:pPr>
+      <w:r>
+        <w:rPr>
+          <w:b/>
+          <w:shd w:val="clear" w:color="auto" w:fill="EAEAEA"/>
+        </w:rPr>
+        <w:t>Tema obligatorio / optativo</w:t>
+      </w:r>
+      <w:r>
+        <w:t>: Las mismas recomendaciones de catálogo, agrupadas como lista de áreas de oportunidad.</w:t>
+      </w:r>
+    </w:p>
+    <w:p>
+      <w:r>
+        <w:t>{% endif %}</w:t>
       </w:r>
     </w:p>
     <w:p>
@@ -51,22 +146,16 @@
         <w:t xml:space="preserve">La empresa </w:t>
       </w:r>
       <w:r>
-        <w:rPr>
-          <w:b/>
-        </w:rPr>
-        <w:t>{{ empresa_nombre }}</w:t>
+        <w:t>{{r empresa_nombre }}</w:t>
       </w:r>
       <w:r>
-        <w:t xml:space="preserve"> se encuentra ubicada en {{ empresa_ubicacion }}. Cuenta con aproximadamente </w:t>
+        <w:t xml:space="preserve"> se encuentra ubicada en {{r empresa_ubicacion }}. Cuenta con aproximadamente </w:t>
       </w:r>
       <w:r>
-        <w:rPr>
-          <w:b/>
-        </w:rPr>
-        <w:t>{{ empresa_num_trabajadores }}</w:t>
+        <w:t>{{r empresa_num_trabajadores }}</w:t>
       </w:r>
       <w:r>
-        <w:t xml:space="preserve"> trabajadores, con el siguiente esquema de turnos: {{ empresa_turnos }}. Su giro es {{ empresa_giro }}. Las actividades relacionadas con el manejo manual de cargas identificadas son: {{ empresa_descripcion_mmh }}.</w:t>
+        <w:t xml:space="preserve"> trabajadores, con el siguiente esquema de turnos: {{r empresa_turnos }}. Su giro es {{r empresa_giro }}. Las actividades relacionadas con el manejo manual de cargas identificadas son: {{r empresa_descripcion_mmh }}.</w:t>
       </w:r>
     </w:p>
     <w:p>
@@ -131,7 +220,7 @@
         <w:t xml:space="preserve">Criterio {{ c.numero }}.- </w:t>
       </w:r>
       <w:r>
-        <w:t>{{ c.narrativa }}</w:t>
+        <w:t>{{r c.narrativa }}</w:t>
       </w:r>
     </w:p>
     <w:p>
@@ -154,7 +243,7 @@
     </w:p>
     <w:p>
       <w:r>
-        <w:t>{{ resultado_global_cierre }}</w:t>
+        <w:t>{{r resultado_global_cierre }}</w:t>
       </w:r>
     </w:p>
     <w:p>
@@ -172,7 +261,7 @@
     </w:p>
     <w:p>
       <w:r>
-        <w:t>{{ loop.index }}. {{ tema }}</w:t>
+        <w:t>{{ loop.index }}. {{r tema }}</w:t>
       </w:r>
     </w:p>
     <w:p>
@@ -195,7 +284,7 @@
     </w:p>
     <w:p>
       <w:r>
-        <w:t>{{ loop.index }}. {{ tema }}</w:t>
+        <w:t>{{ loop.index }}. {{r tema }}</w:t>
       </w:r>
     </w:p>
     <w:p>

</xml_diff>

<commit_message>
Pulir gráfica de radar y agregar gráfica de temas obligatorios/optativos
A solicitud del Dr. Sergio: gráficos más explicativos en el informe.

- Radar: fondo con las 5 franjas de severidad (mismos colores y cortes
  que el resto del sistema, validados para papel impreso — ver
  contenido/como-se-calculan-los-porcentajes.md), etiquetas de valor
  directas en cada eje, leyenda de franjas, tipografía más clara.
  Corrige además un choque visual entre el título y la etiqueta del
  único eje en el caso degenerado de un solo criterio.
- Nueva gráfica de pastel (dona) con la proporción de temas
  obligatorios vs. optativos del cierre global, para que se entienda
  de un vistazo cuánto de lo señalado es exigencia normativa y cuánto
  es sugerencia. Se omite cuando no hay temas de ningún tipo.
- Paleta validada con el script de la skill de dataviz (separación
  perceptible con daltonismo y contraste sobre fondo blanco).
</commit_message>
<xml_diff>
--- a/service/app/templates/informe_base.docx
+++ b/service/app/templates/informe_base.docx
@@ -244,6 +244,24 @@
     <w:p>
       <w:r>
         <w:t>{{r resultado_global_cierre }}</w:t>
+      </w:r>
+    </w:p>
+    <w:p>
+      <w:r>
+        <w:t>{% if hay_temas %}</w:t>
+      </w:r>
+    </w:p>
+    <w:p>
+      <w:pPr>
+        <w:jc w:val="center"/>
+      </w:pPr>
+      <w:r>
+        <w:t>{{ grafica_temas }}</w:t>
+      </w:r>
+    </w:p>
+    <w:p>
+      <w:r>
+        <w:t>{% endif %}</w:t>
       </w:r>
     </w:p>
     <w:p>

</xml_diff>

<commit_message>
Simplificar el lenguaje del informe y conectar la apertura global
A solicitud del Dr. Sergio: menos lenguaje técnico, priorizando el
entendimiento de las recomendaciones.

- Reescribe las 50 recomendaciones y las 20 plantillas (Criterio 1 +
  global) en frases más cortas y directas; el numeral de la NOM-036
  se mueve al final entre paréntesis en vez de ir a media oración
  (supabase/content_v2_lenguaje_simple.sql).
- Simplifica los textos fijos de la plantilla (introducción,
  metodología).
- Conecta la plantilla de "apertura global" por franja de
  cumplimiento, que existía en la base de datos desde la Etapa 4/6
  pero nunca se leía ni se usaba en el render — ahora introduce la
  sección "Áreas de oportunidad" antes del cierre.
- Actualiza contenido/criterio-1-recomendaciones.md para que el
  documento de revisión del Dr. Sergio coincida con el contenido
  real cargado en la base de datos.
</commit_message>
<xml_diff>
--- a/service/app/templates/informe_base.docx
+++ b/service/app/templates/informe_base.docx
@@ -29,7 +29,7 @@
     </w:p>
     <w:p>
       <w:r>
-        <w:t xml:space="preserve">La NOM-036-1-STPS-2018 establece los lineamientos para identificar, analizar, prevenir y controlar los factores de riesgo ergonómico derivados del manejo manual de cargas en los centros de trabajo. El presente documento resume los resultados obtenidos al aplicar el instrumento de autoevaluación con base en dicha norma dentro de la empresa </w:t>
+        <w:t xml:space="preserve">La NOM-036-1-STPS-2018 busca identificar y prevenir los riesgos de salud que puede causar el manejo manual de cargas en el trabajo. Este documento resume los resultados de la autoevaluación que respondió la empresa </w:t>
       </w:r>
       <w:r>
         <w:t>{{r empresa_nombre }}.</w:t>
@@ -168,7 +168,7 @@
     </w:p>
     <w:p>
       <w:r>
-        <w:t>El instrumento de evaluación se divide en secciones (criterios), cada una constituida por diez ítems o afirmaciones calificados en una escala de 0 a 4, en donde 0 = Nada y 4 = Óptimo. La calificación máxima por criterio es de 40 puntos; entre mayor sea el puntaje, mayor es el grado de cumplimiento de la norma en ese rubro.</w:t>
+        <w:t>El cuestionario se divide en temas. Cada tema tiene diez preguntas, calificadas del 0 (Nada) al 4 (Óptimo). Entre más alto es el puntaje de un tema, mejor cumple la empresa con la norma en ese tema.</w:t>
       </w:r>
     </w:p>
     <w:p>
@@ -238,7 +238,7 @@
     </w:p>
     <w:p>
       <w:r>
-        <w:t>A continuación se describen los puntos identificados en los que se considera que se puede trabajar para facilitar la implementación y el cumplimiento de la NOM-036-1-STPS-2018.</w:t>
+        <w:t>{{r resultado_global_apertura }}</w:t>
       </w:r>
     </w:p>
     <w:p>

</xml_diff>

<commit_message>
Pulir el diseño visual del informe .docx generado
Tipografía, color de marca y tablas consistentes, portada con salto de
página, pie de página con numeración y clasificación por criterio coloreada
según la misma paleta de severidad del radar — antes el documento usaba
únicamente el formato por defecto de python-docx.
</commit_message>
<xml_diff>
--- a/service/app/templates/informe_base.docx
+++ b/service/app/templates/informe_base.docx
@@ -6,6 +6,9 @@
       <w:pPr>
         <w:pStyle w:val="Title"/>
         <w:jc w:val="center"/>
+        <w:pBdr>
+          <w:bottom w:val="single" w:sz="12" w:space="4" w:color="1F3A5F"/>
+        </w:pBdr>
       </w:pPr>
       <w:r>
         <w:t>Informe de Pre Diagnóstico Empresarial</w:t>
@@ -16,18 +19,76 @@
         <w:jc w:val="center"/>
       </w:pPr>
       <w:r>
+        <w:rPr>
+          <w:i/>
+          <w:color w:val="595956"/>
+          <w:sz w:val="26"/>
+        </w:rPr>
         <w:t>Identificación de factores de riesgo ergonómico por manejo manual de cargas, con base en la NOM-036-1-STPS-2018</w:t>
+      </w:r>
+    </w:p>
+    <w:p/>
+    <w:p>
+      <w:pPr>
+        <w:jc w:val="center"/>
+      </w:pPr>
+      <w:r>
+        <w:rPr>
+          <w:b/>
+        </w:rPr>
+        <w:t xml:space="preserve">Empresa evaluada: </w:t>
+      </w:r>
+      <w:r>
+        <w:t>{{r empresa_nombre }}</w:t>
+      </w:r>
+    </w:p>
+    <w:p>
+      <w:pPr>
+        <w:jc w:val="center"/>
+      </w:pPr>
+      <w:r>
+        <w:rPr>
+          <w:b/>
+        </w:rPr>
+        <w:t xml:space="preserve">Fecha de generación: </w:t>
+      </w:r>
+      <w:r>
+        <w:t>{{ fecha_generacion }}</w:t>
+      </w:r>
+    </w:p>
+    <w:p>
+      <w:pPr>
+        <w:jc w:val="center"/>
+      </w:pPr>
+      <w:r>
+        <w:rPr>
+          <w:i/>
+          <w:color w:val="595956"/>
+          <w:sz w:val="19"/>
+        </w:rPr>
+        <w:t>Documento confidencial. Su contenido está dirigido exclusivamente a la empresa evaluada y al equipo responsable de la validación de este instrumento.</w:t>
+      </w:r>
+    </w:p>
+    <w:p>
+      <w:r>
+        <w:br w:type="page"/>
       </w:r>
     </w:p>
     <w:p>
       <w:pPr>
         <w:pStyle w:val="Heading1"/>
+        <w:pBdr>
+          <w:bottom w:val="single" w:sz="6" w:space="4" w:color="1F3A5F"/>
+        </w:pBdr>
       </w:pPr>
       <w:r>
         <w:t>Introducción</w:t>
       </w:r>
     </w:p>
     <w:p>
+      <w:pPr>
+        <w:jc w:val="both"/>
+      </w:pPr>
       <w:r>
         <w:t xml:space="preserve">La NOM-036-1-STPS-2018 busca identificar y prevenir los riesgos de salud que puede causar el manejo manual de cargas en el trabajo. Este documento resume los resultados de la autoevaluación que respondió la empresa </w:t>
       </w:r>
@@ -136,12 +197,18 @@
     <w:p>
       <w:pPr>
         <w:pStyle w:val="Heading1"/>
+        <w:pBdr>
+          <w:bottom w:val="single" w:sz="6" w:space="4" w:color="1F3A5F"/>
+        </w:pBdr>
       </w:pPr>
       <w:r>
         <w:t>Información general de la empresa</w:t>
       </w:r>
     </w:p>
     <w:p>
+      <w:pPr>
+        <w:jc w:val="both"/>
+      </w:pPr>
       <w:r>
         <w:t xml:space="preserve">La empresa </w:t>
       </w:r>
@@ -161,12 +228,18 @@
     <w:p>
       <w:pPr>
         <w:pStyle w:val="Heading1"/>
+        <w:pBdr>
+          <w:bottom w:val="single" w:sz="6" w:space="4" w:color="1F3A5F"/>
+        </w:pBdr>
       </w:pPr>
       <w:r>
         <w:t>Resultados de la evaluación</w:t>
       </w:r>
     </w:p>
     <w:p>
+      <w:pPr>
+        <w:jc w:val="both"/>
+      </w:pPr>
       <w:r>
         <w:t>El cuestionario se divide en temas. Cada tema tiene diez preguntas, calificadas del 0 (Nada) al 4 (Óptimo). Entre más alto es el puntaje de un tema, mejor cumple la empresa con la norma en ese tema.</w:t>
       </w:r>
@@ -201,7 +274,23 @@
     </w:p>
     <w:p>
       <w:pPr>
+        <w:jc w:val="center"/>
+      </w:pPr>
+      <w:r>
+        <w:rPr>
+          <w:i/>
+          <w:color w:val="595956"/>
+          <w:sz w:val="19"/>
+        </w:rPr>
+        <w:t>Figura 1. Porcentaje de cumplimiento por criterio, sobre las 5 franjas de severidad.</w:t>
+      </w:r>
+    </w:p>
+    <w:p>
+      <w:pPr>
         <w:pStyle w:val="Heading1"/>
+        <w:pBdr>
+          <w:bottom w:val="single" w:sz="6" w:space="4" w:color="1F3A5F"/>
+        </w:pBdr>
       </w:pPr>
       <w:r>
         <w:t>Resultados por criterio</w:t>
@@ -213,6 +302,9 @@
       </w:r>
     </w:p>
     <w:p>
+      <w:pPr>
+        <w:jc w:val="both"/>
+      </w:pPr>
       <w:r>
         <w:rPr>
           <w:b/>
@@ -231,17 +323,26 @@
     <w:p>
       <w:pPr>
         <w:pStyle w:val="Heading1"/>
+        <w:pBdr>
+          <w:bottom w:val="single" w:sz="6" w:space="4" w:color="1F3A5F"/>
+        </w:pBdr>
       </w:pPr>
       <w:r>
         <w:t>Áreas de oportunidad</w:t>
       </w:r>
     </w:p>
     <w:p>
+      <w:pPr>
+        <w:jc w:val="both"/>
+      </w:pPr>
       <w:r>
         <w:t>{{r resultado_global_apertura }}</w:t>
       </w:r>
     </w:p>
     <w:p>
+      <w:pPr>
+        <w:jc w:val="both"/>
+      </w:pPr>
       <w:r>
         <w:t>{{r resultado_global_cierre }}</w:t>
       </w:r>
@@ -260,6 +361,19 @@
       </w:r>
     </w:p>
     <w:p>
+      <w:pPr>
+        <w:jc w:val="center"/>
+      </w:pPr>
+      <w:r>
+        <w:rPr>
+          <w:i/>
+          <w:color w:val="595956"/>
+          <w:sz w:val="19"/>
+        </w:rPr>
+        <w:t>Figura 2. Proporción de temas de atención obligatoria y optativa.</w:t>
+      </w:r>
+    </w:p>
+    <w:p>
       <w:r>
         <w:t>{% endif %}</w:t>
       </w:r>
@@ -274,10 +388,18 @@
     </w:p>
     <w:p>
       <w:r>
+        <w:t>Derivados directamente de las exigencias de la NOM-036-1-STPS-2018 para los temas evaluados con nivel de cumplimiento bajo.</w:t>
+      </w:r>
+    </w:p>
+    <w:p>
+      <w:r>
         <w:t>{% for tema in temas_obligatorios %}</w:t>
       </w:r>
     </w:p>
     <w:p>
+      <w:pPr>
+        <w:pStyle w:val="ListBullet"/>
+      </w:pPr>
       <w:r>
         <w:t>{{ loop.index }}. {{r tema }}</w:t>
       </w:r>
@@ -297,10 +419,18 @@
     </w:p>
     <w:p>
       <w:r>
+        <w:t>Buenas prácticas sugeridas, adicionales a lo que exige la norma.</w:t>
+      </w:r>
+    </w:p>
+    <w:p>
+      <w:r>
         <w:t>{% for tema in temas_optativos %}</w:t>
       </w:r>
     </w:p>
     <w:p>
+      <w:pPr>
+        <w:pStyle w:val="ListBullet"/>
+      </w:pPr>
       <w:r>
         <w:t>{{ loop.index }}. {{r tema }}</w:t>
       </w:r>
@@ -311,16 +441,27 @@
       </w:r>
     </w:p>
     <w:p>
+      <w:pPr>
+        <w:pBdr>
+          <w:bottom w:val="single" w:sz="4" w:space="4" w:color="1F3A5F"/>
+        </w:pBdr>
+      </w:pPr>
+    </w:p>
+    <w:p>
       <w:r>
         <w:t>Atentamente,</w:t>
       </w:r>
     </w:p>
     <w:p>
       <w:r>
+        <w:rPr>
+          <w:b/>
+        </w:rPr>
         <w:t>Equipo de investigación en Ergonomía y Factores Humanos</w:t>
       </w:r>
     </w:p>
     <w:sectPr>
+      <w:footerReference w:type="default" r:id="rId9"/>
       <w:pgSz w:w="12240" w:h="15840"/>
       <w:pgMar w:top="1440" w:right="1800" w:bottom="1440" w:left="1800" w:header="720" w:footer="720" w:gutter="0"/>
       <w:cols w:space="720"/>
@@ -328,6 +469,53 @@
     </w:sectPr>
   </w:body>
 </w:document>
+</file>
+
+<file path=word/footer1.xml><?xml version="1.0" encoding="utf-8"?>
+<w:ftr xmlns:m="http://schemas.openxmlformats.org/officeDocument/2006/math" xmlns:mc="http://schemas.openxmlformats.org/markup-compatibility/2006" xmlns:mo="http://schemas.microsoft.com/office/mac/office/2008/main" xmlns:mv="urn:schemas-microsoft-com:mac:vml" xmlns:o="urn:schemas-microsoft-com:office:office" xmlns:r="http://schemas.openxmlformats.org/officeDocument/2006/relationships" xmlns:v="urn:schemas-microsoft-com:vml" xmlns:w10="urn:schemas-microsoft-com:office:word" xmlns:w14="http://schemas.microsoft.com/office/word/2010/wordml" xmlns:w="http://schemas.openxmlformats.org/wordprocessingml/2006/main" xmlns:wne="http://schemas.microsoft.com/office/word/2006/wordml" xmlns:wp14="http://schemas.microsoft.com/office/word/2010/wordprocessingDrawing" xmlns:wp="http://schemas.openxmlformats.org/drawingml/2006/wordprocessingDrawing" xmlns:wpc="http://schemas.microsoft.com/office/word/2010/wordprocessingCanvas" xmlns:wpg="http://schemas.microsoft.com/office/word/2010/wordprocessingGroup" xmlns:wpi="http://schemas.microsoft.com/office/word/2010/wordprocessingInk" xmlns:wps="http://schemas.microsoft.com/office/word/2010/wordprocessingShape" mc:Ignorable="w14 wp14">
+  <w:p>
+    <w:pPr>
+      <w:pStyle w:val="Footer"/>
+      <w:jc w:val="center"/>
+    </w:pPr>
+    <w:r>
+      <w:rPr>
+        <w:rFonts w:ascii="Calibri" w:hAnsi="Calibri"/>
+        <w:color w:val="595956"/>
+        <w:sz w:val="18"/>
+      </w:rPr>
+      <w:t xml:space="preserve">Página </w:t>
+    </w:r>
+    <w:fldSimple w:instr="PAGE">
+      <w:r>
+        <w:rPr>
+          <w:rFonts w:ascii="Calibri"/>
+          <w:sz w:val="18"/>
+          <w:color w:val="595956"/>
+        </w:rPr>
+        <w:t>1</w:t>
+      </w:r>
+    </w:fldSimple>
+    <w:r>
+      <w:rPr>
+        <w:rFonts w:ascii="Calibri" w:hAnsi="Calibri"/>
+        <w:color w:val="595956"/>
+        <w:sz w:val="18"/>
+      </w:rPr>
+      <w:t xml:space="preserve"> de </w:t>
+    </w:r>
+    <w:fldSimple w:instr="NUMPAGES">
+      <w:r>
+        <w:rPr>
+          <w:rFonts w:ascii="Calibri"/>
+          <w:sz w:val="18"/>
+          <w:color w:val="595956"/>
+        </w:rPr>
+        <w:t>1</w:t>
+      </w:r>
+    </w:fldSimple>
+  </w:p>
+</w:ftr>
 </file>
 
 <file path=word/numbering.xml><?xml version="1.0" encoding="utf-8"?>
@@ -693,6 +881,14 @@
     <w:name w:val="Normal"/>
     <w:qFormat/>
     <w:rsid w:val="00FC693F"/>
+    <w:pPr>
+      <w:spacing w:after="160" w:line="276" w:lineRule="auto"/>
+    </w:pPr>
+    <w:rPr>
+      <w:rFonts w:ascii="Calibri" w:hAnsi="Calibri"/>
+      <w:color w:val="262626"/>
+      <w:sz w:val="22"/>
+    </w:rPr>
   </w:style>
   <w:style w:type="paragraph" w:styleId="Header">
     <w:name w:val="header"/>
@@ -749,15 +945,16 @@
     <w:pPr>
       <w:keepNext/>
       <w:keepLines/>
-      <w:spacing w:before="480" w:after="0"/>
+      <w:spacing w:before="360" w:after="120"/>
       <w:outlineLvl w:val="0"/>
     </w:pPr>
     <w:rPr>
-      <w:rFonts w:asciiTheme="majorHAnsi" w:eastAsiaTheme="majorEastAsia" w:hAnsiTheme="majorHAnsi" w:cstheme="majorBidi"/>
+      <w:rFonts w:asciiTheme="majorHAnsi" w:eastAsiaTheme="majorEastAsia" w:hAnsiTheme="majorHAnsi" w:cstheme="majorBidi" w:ascii="Calibri" w:hAnsi="Calibri"/>
       <w:b/>
       <w:bCs/>
-      <w:color w:val="365F91" w:themeColor="accent1" w:themeShade="BF"/>
-      <w:sz w:val="28"/>
+      <w:i w:val="0"/>
+      <w:color w:val="1F3A5F"/>
+      <w:sz w:val="32"/>
       <w:szCs w:val="28"/>
     </w:rPr>
   </w:style>
@@ -773,14 +970,15 @@
     <w:pPr>
       <w:keepNext/>
       <w:keepLines/>
-      <w:spacing w:before="200" w:after="0"/>
+      <w:spacing w:before="360" w:after="120"/>
       <w:outlineLvl w:val="1"/>
     </w:pPr>
     <w:rPr>
-      <w:rFonts w:asciiTheme="majorHAnsi" w:eastAsiaTheme="majorEastAsia" w:hAnsiTheme="majorHAnsi" w:cstheme="majorBidi"/>
+      <w:rFonts w:asciiTheme="majorHAnsi" w:eastAsiaTheme="majorEastAsia" w:hAnsiTheme="majorHAnsi" w:cstheme="majorBidi" w:ascii="Calibri" w:hAnsi="Calibri"/>
       <w:b/>
       <w:bCs/>
-      <w:color w:val="4F81BD" w:themeColor="accent1"/>
+      <w:i w:val="0"/>
+      <w:color w:val="1F3A5F"/>
       <w:sz w:val="26"/>
       <w:szCs w:val="26"/>
     </w:rPr>
@@ -797,14 +995,16 @@
     <w:pPr>
       <w:keepNext/>
       <w:keepLines/>
-      <w:spacing w:before="200" w:after="0"/>
+      <w:spacing w:before="360" w:after="120"/>
       <w:outlineLvl w:val="2"/>
     </w:pPr>
     <w:rPr>
-      <w:rFonts w:asciiTheme="majorHAnsi" w:eastAsiaTheme="majorEastAsia" w:hAnsiTheme="majorHAnsi" w:cstheme="majorBidi"/>
+      <w:rFonts w:asciiTheme="majorHAnsi" w:eastAsiaTheme="majorEastAsia" w:hAnsiTheme="majorHAnsi" w:cstheme="majorBidi" w:ascii="Calibri" w:hAnsi="Calibri"/>
       <w:b/>
       <w:bCs/>
-      <w:color w:val="4F81BD" w:themeColor="accent1"/>
+      <w:i w:val="0"/>
+      <w:color w:val="1F3A5F"/>
+      <w:sz w:val="24"/>
     </w:rPr>
   </w:style>
   <w:style w:type="paragraph" w:styleId="Heading4">
@@ -1042,11 +1242,12 @@
       <w:contextualSpacing/>
     </w:pPr>
     <w:rPr>
-      <w:rFonts w:asciiTheme="majorHAnsi" w:eastAsiaTheme="majorEastAsia" w:hAnsiTheme="majorHAnsi" w:cstheme="majorBidi"/>
-      <w:color w:val="17365D" w:themeColor="text2" w:themeShade="BF"/>
+      <w:rFonts w:asciiTheme="majorHAnsi" w:eastAsiaTheme="majorEastAsia" w:hAnsiTheme="majorHAnsi" w:cstheme="majorBidi" w:ascii="Calibri" w:hAnsi="Calibri"/>
+      <w:b/>
+      <w:color w:val="1F3A5F"/>
       <w:spacing w:val="5"/>
       <w:kern w:val="28"/>
-      <w:sz w:val="52"/>
+      <w:sz w:val="56"/>
       <w:szCs w:val="52"/>
     </w:rPr>
   </w:style>
@@ -1222,6 +1423,11 @@
       </w:numPr>
       <w:contextualSpacing/>
     </w:pPr>
+    <w:rPr>
+      <w:rFonts w:ascii="Calibri" w:hAnsi="Calibri"/>
+      <w:color w:val="262626"/>
+      <w:sz w:val="22"/>
+    </w:rPr>
   </w:style>
   <w:style w:type="paragraph" w:styleId="ListBullet2">
     <w:name w:val="List Bullet 2"/>

</xml_diff>

<commit_message>
Agregar heatmap de 50 ítems al informe (Figura 2)
grafica.py::generar_heatmap_items dibuja una fila por criterio y una
columna por ítem, con el mismo color de severidad 0-4 que usan el radar y
la Tabla 2 (COLOR_POR_BUCKET), pero con la etiqueta de NIVEL de un ítem
("Nada", "Mínimo"...) en vez de la de bucket ("Inexistente"...) — son
conceptos distintos aunque compartan color, así que se agrega
engine/scoring.py::ETIQUETA_POR_NIVEL en vez de reutilizar
ETIQUETA_POR_BUCKET.

Se inserta como la nueva "Figura 2" del informe, después del radar; la
dona de temas obligatorios/optativos pasa a ser "Figura 3". No tiene caso
degenerado como el radar: con 1 criterio dibuja 1 fila, con los 5
completos dibuja 5.

Verificado visualmente con contenido real de la base (1 fila y 5 filas) y
con 4 tests nuevos. Las 2 pruebas que contaban imágenes en el .docx se
actualizaron (radar + heatmap se insertan siempre, +1 si hay temas).
</commit_message>
<xml_diff>
--- a/service/app/templates/informe_base.docx
+++ b/service/app/templates/informe_base.docx
@@ -306,6 +306,27 @@
     </w:p>
     <w:p>
       <w:pPr>
+        <w:jc w:val="center"/>
+      </w:pPr>
+      <w:r>
+        <w:t>{{ grafica_heatmap }}</w:t>
+      </w:r>
+    </w:p>
+    <w:p>
+      <w:pPr>
+        <w:jc w:val="center"/>
+      </w:pPr>
+      <w:r>
+        <w:rPr>
+          <w:i/>
+          <w:color w:val="595956"/>
+          <w:sz w:val="19"/>
+        </w:rPr>
+        <w:t>Figura 2. Nivel de respuesta (0-4) de cada ítem, agrupado por criterio evaluado.</w:t>
+      </w:r>
+    </w:p>
+    <w:p>
+      <w:pPr>
         <w:pStyle w:val="Heading1"/>
         <w:pBdr>
           <w:bottom w:val="single" w:sz="6" w:space="4" w:color="1F3A5F"/>
@@ -399,7 +420,7 @@
           <w:color w:val="595956"/>
           <w:sz w:val="19"/>
         </w:rPr>
-        <w:t>Figura 2. Proporción de temas de atención obligatoria y optativa.</w:t>
+        <w:t>Figura 3. Proporción de temas de atención obligatoria y optativa.</w:t>
       </w:r>
     </w:p>
     <w:p>

</xml_diff>

<commit_message>
Convertir la narrativa por criterio en un diagnóstico, al estilo JASANA
- Cada criterio: apertura por franja, aspectos favorables y por atender
  (descripción del nivel respondido) y una implicación por criterio y
  franja. Las recomendaciones quedan solo en Áreas de oportunidad.
- Nuevo tipo de plantilla 'implicacion' y 25 textos nuevos; 16
  recomendaciones reescritas para entenderse fuera de contexto.
- Introducción corregida contra el DOF: vigencia 2020/2023 y aplicación
  al manejo de cargas más de una vez al día.
</commit_message>
<xml_diff>
--- a/service/app/templates/informe_base.docx
+++ b/service/app/templates/informe_base.docx
@@ -98,7 +98,7 @@
         <w:jc w:val="both"/>
       </w:pPr>
       <w:r>
-        <w:t>Esta norma es aplicable a todo puesto de trabajo en el que se manipulen o transporten objetos con un peso superior a 3 kg, aun cuando la actividad se realice una sola vez al día.</w:t>
+        <w:t>La norma entró en vigor el 2 de enero de 2020, y desde el 4 de enero de 2023 son exigibles también el análisis de los factores de riesgo ergonómico y el programa de ergonomía. Aplica en todos los centros de trabajo donde existan trabajadores que realicen manejo manual de cargas de forma cotidiana (más de una vez al día), considerando como carga todo objeto con una masa de 3 kg o más.</w:t>
       </w:r>
     </w:p>
     <w:p>
@@ -175,7 +175,7 @@
         <w:t>Plantilla fija</w:t>
       </w:r>
       <w:r>
-        <w:t>: Texto de apertura o cierre que depende solo de la franja de severidad — el mismo para cualquier empresa que caiga en ella.</w:t>
+        <w:t>: Texto de apertura, implicación o cierre que depende solo de la franja de severidad — el mismo para cualquier empresa que caiga en ella.</w:t>
       </w:r>
     </w:p>
     <w:p>
@@ -187,10 +187,10 @@
           <w:b/>
           <w:shd w:val="clear" w:color="auto" w:fill="FCE5CD"/>
         </w:rPr>
-        <w:t>Recomendación de catálogo</w:t>
+        <w:t>Texto de catálogo por ítem</w:t>
       </w:r>
       <w:r>
-        <w:t>: Texto elegido del catálogo ítem-nivel según la respuesta específica de la empresa.</w:t>
+        <w:t>: Descripción del nivel respondido en un ítem, elegida del catálogo ítem-nivel según la respuesta específica de la empresa.</w:t>
       </w:r>
     </w:p>
     <w:p>
@@ -241,7 +241,15 @@
         <w:t>{{r empresa_num_trabajadores }}</w:t>
       </w:r>
       <w:r>
-        <w:t xml:space="preserve"> trabajadores, con el siguiente esquema de turnos: {{r empresa_turnos }}. Su giro es {{r empresa_giro }}. Las actividades relacionadas con el manejo manual de cargas identificadas son: {{r empresa_descripcion_mmh }}.</w:t>
+        <w:t xml:space="preserve"> trabajadores, organizados en {{r empresa_turnos }}, y su actividad principal es {{r empresa_giro }}.</w:t>
+      </w:r>
+    </w:p>
+    <w:p>
+      <w:pPr>
+        <w:jc w:val="both"/>
+      </w:pPr>
+      <w:r>
+        <w:t>Como actividades relacionadas con el manejo manual de cargas, la empresa reporta las siguientes: {{r empresa_descripcion_mmh }}.</w:t>
       </w:r>
     </w:p>
     <w:p>
@@ -260,7 +268,7 @@
         <w:jc w:val="both"/>
       </w:pPr>
       <w:r>
-        <w:t>El cuestionario se divide en temas. Cada tema tiene diez preguntas, calificadas del 0 (Nada) al 4 (Óptimo). Entre más alto es el puntaje de un tema, mejor cumple la empresa con la norma en ese tema.</w:t>
+        <w:t>El instrumento de autoevaluación se divide en cinco criterios, cada uno integrado por diez ítems que se califican en una escala del 0 (Nada) al 4 (Óptimo). La calificación máxima de cada criterio es de 40 puntos: entre mayor sea el puntaje, mayor es el grado de cumplimiento de la NOM-036-1-STPS-2018 en ese criterio. Los resultados se presentan en las tablas 1 y 2 y en las figuras 1 y 2.</w:t>
       </w:r>
     </w:p>
     <w:p>
@@ -281,6 +289,14 @@
     <w:p>
       <w:r>
         <w:t>[[TABLA_PORCENTAJES]]</w:t>
+      </w:r>
+    </w:p>
+    <w:p>
+      <w:pPr>
+        <w:jc w:val="both"/>
+      </w:pPr>
+      <w:r>
+        <w:t>La calificación de cada criterio se convirtió en porcentaje para facilitar su interpretación, y cada porcentaje se clasificó en una de cinco franjas de 20 puntos (Inexistente, Mínimo, Regular, Aceptable y Óptimo). Estos resultados reflejan el grado de cumplimiento percibido por la persona que respondió la autoevaluación, por lo que conviene corroborarlos en el centro de trabajo.</w:t>
       </w:r>
     </w:p>
     <w:p>

</xml_diff>